<commit_message>
Add crash-circumstance strata (manner, weather, rurality, alcohol) + JSR PNG/TIFF package
- build_fars_strata.py: new dims manner (MAN_COLL), weather (WEATHER),
  rururb (RUR_URB), alcohol (any driver with police-reported drinking)
- analyze_us_strata.py: fit primary model per stratum -> us_crashcontext_response.csv
- figures_us.py: fig_us_crashcontext forest plot
- make_manuscript.py: new Results paragraph + Table 6 + Figure 9 (Japan
  figures renumbered 10-11, sensitivity table -> 7), methods/limitations/
  discussion updated, STROBE locations updated
- make_jsr_submission.py: cover letter highlights new mechanism evidence;
  zip now includes per-figure PNG+TIFF and tables.docx

Co-Authored-By: Tatsuki Onishi <bougtoir@gmail.com>
</commit_message>
<xml_diff>
--- a/output/manuscript/heat_crash_mortality.docx
+++ b/output/manuscript/heat_crash_mortality.docx
@@ -538,7 +538,7 @@
         <w:t>14</w:t>
       </w:r>
       <w:r>
-        <w:t xml:space="preserve"> We performed three further US analyses: (i) refitting the same-day model within crash-hour bands to test whether the excess concentrates in the hottest hours; (ii) refitting it by road-user type (vehicle occupant, motorcyclist, pedestrian, cyclist) and age band from FARS person records, as a mechanistic and vulnerability analysis; and (iii) projecting the additional crash deaths under uniform warming scenarios of the daily temperature distribution (+1, +2, +3 °C), holding activity and baseline rates constant. All data are public and the full pipeline is reproducible from source (see Data availability). Reporting follows the Strengthening the Reporting of Observational Studies in Epidemiology (STROBE) guideline (checklist provided).</w:t>
+        <w:t xml:space="preserve"> We performed three further US analyses: (i) refitting the same-day model within crash-hour bands to test whether the excess concentrates in the hottest hours; (ii) refitting it by road-user type (vehicle occupant, motorcyclist, pedestrian, cyclist), age band and crash circumstances (manner of collision, weather condition, rural/urban land use and police-reported driver drinking) from FARS records, as mechanistic and vulnerability analyses; and (iii) projecting the additional crash deaths under uniform warming scenarios of the daily temperature distribution (+1, +2, +3 °C), holding activity and baseline rates constant. All data are public and the full pipeline is reproducible from source (see Data availability). Reporting follows the Strengthening the Reporting of Observational Studies in Epidemiology (STROBE) guideline (checklist provided).</w:t>
       </w:r>
     </w:p>
     <w:p>
@@ -2007,7 +2007,47 @@
         <w:spacing w:after="120" w:line="480" w:lineRule="auto"/>
       </w:pPr>
       <w:r>
-        <w:t>Sensitivity to activity, precipitation and heat-stress controls is summarized in Table 6. All added continuous terms were z-scored linear terms; state population entered as a log offset, and heat-stress metrics were expressed as anomalies relative to their day-of-year climatology. The primary full-controls model was selected by iteratively removing added controls with VIF &gt; 10; dropped variables were vmt_state (VIF=323.8); humidex_anom (VIF=63.5); heat_index_anom (VIF=24.5). A stricter VIF &lt; 5 screen and an unscreened full-controls model are also shown. Heat-stress metrics showed high collinearity with the temperature anomaly when entered individually, so they are reported separately as sensitivity analyses rather than being included simultaneously.</w:t>
+        <w:t>Crash-level strata provided four further checks on the mechanism and on robustness (Fig. 9; Table 6). The same-day excess was larger for single-vehicle crashes—those whose first harmful event was not a collision with another motor vehicle in transport, including run-off-road and pedestrian-involved crashes—than for multi-vehicle collisions (RR 1.199 (1.161-1.238) vs 1.113 (1.066-1.162)), the pattern expected if heat degrades driver performance independently of interaction with other vehicles. The excess persisted on clear or cloudy days (RR 1.185 (1.148-1.224)) and was similar in adverse weather (RR 1.119 (1.054-1.188)), so it is not explained by precipitation or wet-road surface conditions. Estimates were similar for rural (RR 1.139 (1.096-1.184)) and urban (RR 1.190 (1.150-1.232)) crashes. Finally, the excess was present and of similar magnitude whether or not a driver was reported to have been drinking (RR 1.178 (1.133-1.224) and 1.191 (1.119-1.269) respectively), indicating that the association is not driven by alcohol-involved crashes; police-reported drinking is, however, under-ascertained in FARS.</w:t>
+      </w:r>
+    </w:p>
+    <w:p/>
+    <w:p>
+      <w:pPr>
+        <w:jc w:val="center"/>
+      </w:pPr>
+      <w:r>
+        <w:drawing>
+          <wp:inline xmlns:a="http://schemas.openxmlformats.org/drawingml/2006/main" xmlns:pic="http://schemas.openxmlformats.org/drawingml/2006/picture">
+            <wp:extent cx="5120640" cy="3175959"/>
+            <wp:docPr id="9" name="Picture 9"/>
+            <wp:cNvGraphicFramePr>
+              <a:graphicFrameLocks noChangeAspect="1"/>
+            </wp:cNvGraphicFramePr>
+            <a:graphic>
+              <a:graphicData uri="http://schemas.openxmlformats.org/drawingml/2006/picture">
+                <pic:pic>
+                  <pic:nvPicPr>
+                    <pic:cNvPr id="0" name="fig_us_crashcontext.png"/>
+                    <pic:cNvPicPr/>
+                  </pic:nvPicPr>
+                  <pic:blipFill>
+                    <a:blip r:embed="rId17"/>
+                    <a:stretch>
+                      <a:fillRect/>
+                    </a:stretch>
+                  </pic:blipFill>
+                  <pic:spPr>
+                    <a:xfrm>
+                      <a:off x="0" y="0"/>
+                      <a:ext cx="5120640" cy="3175959"/>
+                    </a:xfrm>
+                    <a:prstGeom prst="rect"/>
+                  </pic:spPr>
+                </pic:pic>
+              </a:graphicData>
+            </a:graphic>
+          </wp:inline>
+        </w:drawing>
       </w:r>
     </w:p>
     <w:p>
@@ -2018,7 +2058,354 @@
         <w:rPr>
           <w:b/>
         </w:rPr>
+        <w:t xml:space="preserve">Figure 9. </w:t>
+      </w:r>
+      <w:r>
+        <w:t>United States same-day rate ratio of crash death for a +9 °C anomaly by crash circumstances: manner of collision, weather condition, rural/urban land use and police-reported driver drinking. The excess is present for clear or cloudy days, is larger for single-vehicle (not a collision with a motor vehicle in transport) than multi-vehicle crashes, and is similar regardless of reported driver drinking—patterns consistent with a direct heat contribution rather than adverse-weather surface conditions or a purely behavioural pathway. These subgroup analyses are exploratory and are not adjusted for multiple comparisons.</w:t>
+      </w:r>
+    </w:p>
+    <w:p/>
+    <w:p>
+      <w:pPr>
+        <w:spacing w:before="280"/>
+      </w:pPr>
+      <w:r>
+        <w:rPr>
+          <w:b/>
+        </w:rPr>
         <w:t xml:space="preserve">Table 6. </w:t>
+      </w:r>
+      <w:r>
+        <w:t>United States same-day rate ratio of crash death for a +9 °C anomaly, by crash circumstances (crash-level strata). Single-vehicle crashes are those whose first harmful event was not a collision with a motor vehicle in transport (includes run-off-road and pedestrian crashes); driver drinking is police-reported for any involved driver; crashes with unreported or unknown drinking status are excluded. Subgroup analyses are exploratory and not adjusted for multiple comparisons.</w:t>
+      </w:r>
+    </w:p>
+    <w:tbl>
+      <w:tblPr>
+        <w:tblStyle w:val="TableGrid"/>
+        <w:tblW w:type="auto" w:w="0"/>
+        <w:tblLook w:firstColumn="1" w:firstRow="1" w:lastColumn="0" w:lastRow="0" w:noHBand="0" w:noVBand="1" w:val="04A0"/>
+      </w:tblPr>
+      <w:tblGrid>
+        <w:gridCol w:w="2880"/>
+        <w:gridCol w:w="2880"/>
+        <w:gridCol w:w="2880"/>
+      </w:tblGrid>
+      <w:tr>
+        <w:tc>
+          <w:tcPr>
+            <w:tcW w:type="dxa" w:w="2880"/>
+          </w:tcPr>
+          <w:p>
+            <w:r>
+              <w:rPr>
+                <w:b/>
+              </w:rPr>
+              <w:t>Stratum</w:t>
+            </w:r>
+          </w:p>
+        </w:tc>
+        <w:tc>
+          <w:tcPr>
+            <w:tcW w:type="dxa" w:w="2880"/>
+          </w:tcPr>
+          <w:p>
+            <w:r>
+              <w:rPr>
+                <w:b/>
+              </w:rPr>
+              <w:t>Crash deaths</w:t>
+            </w:r>
+          </w:p>
+        </w:tc>
+        <w:tc>
+          <w:tcPr>
+            <w:tcW w:type="dxa" w:w="2880"/>
+          </w:tcPr>
+          <w:p>
+            <w:r>
+              <w:rPr>
+                <w:b/>
+              </w:rPr>
+              <w:t>Same-day RR (95% CI)</w:t>
+            </w:r>
+          </w:p>
+        </w:tc>
+      </w:tr>
+      <w:tr>
+        <w:tc>
+          <w:tcPr>
+            <w:tcW w:type="dxa" w:w="2880"/>
+          </w:tcPr>
+          <w:p>
+            <w:r>
+              <w:t>Manner of collision: Single-vehicle (not a MVIT collision)</w:t>
+            </w:r>
+          </w:p>
+        </w:tc>
+        <w:tc>
+          <w:tcPr>
+            <w:tcW w:type="dxa" w:w="2880"/>
+          </w:tcPr>
+          <w:p>
+            <w:r>
+              <w:t>160,517</w:t>
+            </w:r>
+          </w:p>
+        </w:tc>
+        <w:tc>
+          <w:tcPr>
+            <w:tcW w:type="dxa" w:w="2880"/>
+          </w:tcPr>
+          <w:p>
+            <w:r>
+              <w:t>1.199 (1.161-1.238)</w:t>
+            </w:r>
+          </w:p>
+        </w:tc>
+      </w:tr>
+      <w:tr>
+        <w:tc>
+          <w:tcPr>
+            <w:tcW w:type="dxa" w:w="2880"/>
+          </w:tcPr>
+          <w:p>
+            <w:r>
+              <w:t>Manner of collision: Multi-vehicle collision</w:t>
+            </w:r>
+          </w:p>
+        </w:tc>
+        <w:tc>
+          <w:tcPr>
+            <w:tcW w:type="dxa" w:w="2880"/>
+          </w:tcPr>
+          <w:p>
+            <w:r>
+              <w:t>111,415</w:t>
+            </w:r>
+          </w:p>
+        </w:tc>
+        <w:tc>
+          <w:tcPr>
+            <w:tcW w:type="dxa" w:w="2880"/>
+          </w:tcPr>
+          <w:p>
+            <w:r>
+              <w:t>1.113 (1.066-1.162)</w:t>
+            </w:r>
+          </w:p>
+        </w:tc>
+      </w:tr>
+      <w:tr>
+        <w:tc>
+          <w:tcPr>
+            <w:tcW w:type="dxa" w:w="2880"/>
+          </w:tcPr>
+          <w:p>
+            <w:r>
+              <w:t>Weather condition: Clear or cloudy</w:t>
+            </w:r>
+          </w:p>
+        </w:tc>
+        <w:tc>
+          <w:tcPr>
+            <w:tcW w:type="dxa" w:w="2880"/>
+          </w:tcPr>
+          <w:p>
+            <w:r>
+              <w:t>212,319</w:t>
+            </w:r>
+          </w:p>
+        </w:tc>
+        <w:tc>
+          <w:tcPr>
+            <w:tcW w:type="dxa" w:w="2880"/>
+          </w:tcPr>
+          <w:p>
+            <w:r>
+              <w:t>1.185 (1.148-1.224)</w:t>
+            </w:r>
+          </w:p>
+        </w:tc>
+      </w:tr>
+      <w:tr>
+        <w:tc>
+          <w:tcPr>
+            <w:tcW w:type="dxa" w:w="2880"/>
+          </w:tcPr>
+          <w:p>
+            <w:r>
+              <w:t>Weather condition: Adverse (rain, snow, fog, wind)</w:t>
+            </w:r>
+          </w:p>
+        </w:tc>
+        <w:tc>
+          <w:tcPr>
+            <w:tcW w:type="dxa" w:w="2880"/>
+          </w:tcPr>
+          <w:p>
+            <w:r>
+              <w:t>44,401</w:t>
+            </w:r>
+          </w:p>
+        </w:tc>
+        <w:tc>
+          <w:tcPr>
+            <w:tcW w:type="dxa" w:w="2880"/>
+          </w:tcPr>
+          <w:p>
+            <w:r>
+              <w:t>1.119 (1.054-1.188)</w:t>
+            </w:r>
+          </w:p>
+        </w:tc>
+      </w:tr>
+      <w:tr>
+        <w:tc>
+          <w:tcPr>
+            <w:tcW w:type="dxa" w:w="2880"/>
+          </w:tcPr>
+          <w:p>
+            <w:r>
+              <w:t>Land use: Rural</w:t>
+            </w:r>
+          </w:p>
+        </w:tc>
+        <w:tc>
+          <w:tcPr>
+            <w:tcW w:type="dxa" w:w="2880"/>
+          </w:tcPr>
+          <w:p>
+            <w:r>
+              <w:t>119,138</w:t>
+            </w:r>
+          </w:p>
+        </w:tc>
+        <w:tc>
+          <w:tcPr>
+            <w:tcW w:type="dxa" w:w="2880"/>
+          </w:tcPr>
+          <w:p>
+            <w:r>
+              <w:t>1.139 (1.096-1.184)</w:t>
+            </w:r>
+          </w:p>
+        </w:tc>
+      </w:tr>
+      <w:tr>
+        <w:tc>
+          <w:tcPr>
+            <w:tcW w:type="dxa" w:w="2880"/>
+          </w:tcPr>
+          <w:p>
+            <w:r>
+              <w:t>Land use: Urban</w:t>
+            </w:r>
+          </w:p>
+        </w:tc>
+        <w:tc>
+          <w:tcPr>
+            <w:tcW w:type="dxa" w:w="2880"/>
+          </w:tcPr>
+          <w:p>
+            <w:r>
+              <w:t>153,418</w:t>
+            </w:r>
+          </w:p>
+        </w:tc>
+        <w:tc>
+          <w:tcPr>
+            <w:tcW w:type="dxa" w:w="2880"/>
+          </w:tcPr>
+          <w:p>
+            <w:r>
+              <w:t>1.190 (1.150-1.232)</w:t>
+            </w:r>
+          </w:p>
+        </w:tc>
+      </w:tr>
+      <w:tr>
+        <w:tc>
+          <w:tcPr>
+            <w:tcW w:type="dxa" w:w="2880"/>
+          </w:tcPr>
+          <w:p>
+            <w:r>
+              <w:t>Driver drinking: No drinking driver</w:t>
+            </w:r>
+          </w:p>
+        </w:tc>
+        <w:tc>
+          <w:tcPr>
+            <w:tcW w:type="dxa" w:w="2880"/>
+          </w:tcPr>
+          <w:p>
+            <w:r>
+              <w:t>121,958</w:t>
+            </w:r>
+          </w:p>
+        </w:tc>
+        <w:tc>
+          <w:tcPr>
+            <w:tcW w:type="dxa" w:w="2880"/>
+          </w:tcPr>
+          <w:p>
+            <w:r>
+              <w:t>1.178 (1.133-1.224)</w:t>
+            </w:r>
+          </w:p>
+        </w:tc>
+      </w:tr>
+      <w:tr>
+        <w:tc>
+          <w:tcPr>
+            <w:tcW w:type="dxa" w:w="2880"/>
+          </w:tcPr>
+          <w:p>
+            <w:r>
+              <w:t>Driver drinking: Drinking driver involved</w:t>
+            </w:r>
+          </w:p>
+        </w:tc>
+        <w:tc>
+          <w:tcPr>
+            <w:tcW w:type="dxa" w:w="2880"/>
+          </w:tcPr>
+          <w:p>
+            <w:r>
+              <w:t>47,963</w:t>
+            </w:r>
+          </w:p>
+        </w:tc>
+        <w:tc>
+          <w:tcPr>
+            <w:tcW w:type="dxa" w:w="2880"/>
+          </w:tcPr>
+          <w:p>
+            <w:r>
+              <w:t>1.191 (1.119-1.269)</w:t>
+            </w:r>
+          </w:p>
+        </w:tc>
+      </w:tr>
+    </w:tbl>
+    <w:p/>
+    <w:p>
+      <w:pPr>
+        <w:spacing w:after="120" w:line="480" w:lineRule="auto"/>
+      </w:pPr>
+      <w:r>
+        <w:t>Sensitivity to activity, precipitation and heat-stress controls is summarized in Table 7. All added continuous terms were z-scored linear terms; state population entered as a log offset, and heat-stress metrics were expressed as anomalies relative to their day-of-year climatology. The primary full-controls model was selected by iteratively removing added controls with VIF &gt; 10; dropped variables were vmt_state (VIF=323.8); humidex_anom (VIF=63.5); heat_index_anom (VIF=24.5). A stricter VIF &lt; 5 screen and an unscreened full-controls model are also shown. Heat-stress metrics showed high collinearity with the temperature anomaly when entered individually, so they are reported separately as sensitivity analyses rather than being included simultaneously.</w:t>
+      </w:r>
+    </w:p>
+    <w:p>
+      <w:pPr>
+        <w:spacing w:before="280"/>
+      </w:pPr>
+      <w:r>
+        <w:rPr>
+          <w:b/>
+        </w:rPr>
+        <w:t xml:space="preserve">Table 7. </w:t>
       </w:r>
       <w:r>
         <w:t>United States sensitivity of the +9 °C anomaly association to activity, precipitation and heat-stress controls. All added continuous controls were z-scored; population entered as a log offset; heat-stress metrics were anomaly-derived. The VIF &lt; 10 row is the primary full-controls model, selected by iteratively removing added controls with VIF &gt; 10. A stricter VIF &lt; 5 screen and an unscreened model are also shown. Heat-stress metrics were tested individually because they are functions of temperature and can be collinear with the anomaly.</w:t>
@@ -2525,7 +2912,7 @@
         <w:spacing w:after="120" w:line="480" w:lineRule="auto"/>
       </w:pPr>
       <w:r>
-        <w:t>We did not pool the Japanese estimates with the US estimates; the comparison is presented only as an exploratory external validation. In Japan (11,576 crash deaths over 6 years) the anomaly exposure-response was imprecise, with a wide confidence band that included the null throughout (Fig. 9); the same-day point estimate for a +9 °C anomaly was 0.940 (95% CI 0.743-1.190) and was not stable across specifications. A direct comparison of the two countries (Fig. 10) shows a precise acute effect in the US, whereas the Japanese panel—with roughly 20-fold fewer annual crash deaths and sparser temperature coverage—is underpowered.</w:t>
+        <w:t>We did not pool the Japanese estimates with the US estimates; the comparison is presented only as an exploratory external validation. In Japan (11,576 crash deaths over 6 years) the anomaly exposure-response was imprecise, with a wide confidence band that included the null throughout (Fig. 10); the same-day point estimate for a +9 °C anomaly was 0.940 (95% CI 0.743-1.190) and was not stable across specifications. A direct comparison of the two countries (Fig. 11) shows a precise acute effect in the US, whereas the Japanese panel—with roughly 20-fold fewer annual crash deaths and sparser temperature coverage—is underpowered.</w:t>
       </w:r>
     </w:p>
     <w:p/>
@@ -2537,7 +2924,7 @@
         <w:drawing>
           <wp:inline xmlns:a="http://schemas.openxmlformats.org/drawingml/2006/main" xmlns:pic="http://schemas.openxmlformats.org/drawingml/2006/picture">
             <wp:extent cx="5120640" cy="3660652"/>
-            <wp:docPr id="9" name="Picture 9"/>
+            <wp:docPr id="10" name="Picture 10"/>
             <wp:cNvGraphicFramePr>
               <a:graphicFrameLocks noChangeAspect="1"/>
             </wp:cNvGraphicFramePr>
@@ -2549,7 +2936,7 @@
                     <pic:cNvPicPr/>
                   </pic:nvPicPr>
                   <pic:blipFill>
-                    <a:blip r:embed="rId17"/>
+                    <a:blip r:embed="rId18"/>
                     <a:stretch>
                       <a:fillRect/>
                     </a:stretch>
@@ -2576,7 +2963,7 @@
         <w:rPr>
           <w:b/>
         </w:rPr>
-        <w:t xml:space="preserve">Figure 9. </w:t>
+        <w:t xml:space="preserve">Figure 10. </w:t>
       </w:r>
       <w:r>
         <w:t>Japan temperature-anomaly exposure-response (2019-2024). The estimate is imprecise: the confidence band is wide and includes the null throughout.</w:t>
@@ -2592,7 +2979,7 @@
         <w:drawing>
           <wp:inline xmlns:a="http://schemas.openxmlformats.org/drawingml/2006/main" xmlns:pic="http://schemas.openxmlformats.org/drawingml/2006/picture">
             <wp:extent cx="5120640" cy="3761953"/>
-            <wp:docPr id="10" name="Picture 10"/>
+            <wp:docPr id="11" name="Picture 11"/>
             <wp:cNvGraphicFramePr>
               <a:graphicFrameLocks noChangeAspect="1"/>
             </wp:cNvGraphicFramePr>
@@ -2604,7 +2991,7 @@
                     <pic:cNvPicPr/>
                   </pic:nvPicPr>
                   <pic:blipFill>
-                    <a:blip r:embed="rId18"/>
+                    <a:blip r:embed="rId19"/>
                     <a:stretch>
                       <a:fillRect/>
                     </a:stretch>
@@ -2631,7 +3018,7 @@
         <w:rPr>
           <w:b/>
         </w:rPr>
-        <w:t xml:space="preserve">Figure 10. </w:t>
+        <w:t xml:space="preserve">Figure 11. </w:t>
       </w:r>
       <w:r>
         <w:t>Same-day rate ratio of traffic-crash deaths for a +9 °C anomaly, United States versus Japan. The US shows a precise acute effect; the Japanese estimate is underpowered. This comparison is exploratory and is not adjusted for multiple comparisons.</w:t>
@@ -2665,7 +3052,7 @@
         <w:spacing w:after="120" w:line="480" w:lineRule="auto"/>
       </w:pPr>
       <w:r>
-        <w:t>Two features of the data argue against confounding by overall driving volume and are consistent with a direct heat effect. The excess rose with direct heat exposure: it was small for enclosed, often air-conditioned vehicle occupants but several-fold larger for motorcyclists, pedestrians and cyclists, who are directly exposed and often physically exerting. It was also largest in the hottest hours of the day. Both patterns are consistent with heat degrading psychomotor and cognitive performance. These gradients are not proof of mechanism, however: open-air travel is itself weather-sensitive, so more motorcycling, cycling and walking on hotter-than-normal days could inflate the open-air estimates through greater exposure rather than physiology, and our activity proxies are national and not mode-specific. Applied to a warmer mean climate, the same exposure-response implies hundreds of additional US crash deaths per year per degree of warming; because these deaths would continue to be coded as ordinary crashes, the societal heat burden they represent would remain uncounted by heat-mortality surveillance.</w:t>
+        <w:t>Two features of the data argue against confounding by overall driving volume and are consistent with a direct heat effect. The excess rose with direct heat exposure: it was small for enclosed, often air-conditioned vehicle occupants but several-fold larger for motorcyclists, pedestrians and cyclists, who are directly exposed and often physically exerting. It was also largest in the hottest hours of the day. Both patterns are consistent with heat degrading psychomotor and cognitive performance. The crash-circumstance strata point the same way: the excess was larger for single-vehicle crashes than for multi-vehicle collisions, persisted on clear days, and was similar whether or not a driver was reported to have been drinking.These gradients are not proof of mechanism, however: open-air travel is itself weather-sensitive, so more motorcycling, cycling and walking on hotter-than-normal days could inflate the open-air estimates through greater exposure rather than physiology, and our activity proxies are national and not mode-specific. Applied to a warmer mean climate, the same exposure-response implies hundreds of additional US crash deaths per year per degree of warming; because these deaths would continue to be coded as ordinary crashes, the societal heat burden they represent would remain uncounted by heat-mortality surveillance.</w:t>
       </w:r>
     </w:p>
     <w:p>
@@ -2689,7 +3076,7 @@
         <w:spacing w:after="120" w:line="480" w:lineRule="auto"/>
       </w:pPr>
       <w:r>
-        <w:t>Several limitations apply. First, this is an ecological, population-level association: it cannot establish that heat caused illness in any specific crash, and neither FARS nor NPA records post-mortem heat diagnosis. Second, exposure is measured at the state/prefecture level from the nearest GHCN-Daily station; this misclassifies individual exposure and does not capture sub-unit variation such as urban heat islands. We therefore added state population as an offset and evaluated GHCN-derived humidity, heat-index and estimated wet-bulb globe temperature metrics in sensitivity models, but these station-based heat-stress measures still do not measure personal exposure. Third, activity adjustment used national monthly proxies for the main model and annual state VMT for the sensitivity model; neither is daily, mode-specific or shared-mobility-specific, and daily state-level or mode-specific activity could alter the road-user and time-of-day gradients. In particular, publicly available daily national counts of pedestrian, bicycle and shared-mobility trips are not available, so we cannot directly separate a weather-related activity shift from a physiological or mechanical heat effect for those modes. Fourth, the Japanese analysis is an exploratory external validation only; its shorter series, far smaller death counts and sparser GHCN-Daily coverage preclude a precise estimate, and we do not pool the two countries. Fifth, the warming projection is a scenario calculation that holds driving activity, the vehicle fleet and behaviour fixed and assumes the anomaly response is stable under a warmer mean climate; it should be read as illustrative of magnitude, not as a forecast. Sixth, the road-user, age and time-of-day subgroup analyses are exploratory: they entail multiple comparisons without formal adjustment, and the open-air road-user gradient may in part reflect weather-related differences in activity rather than physiology. Seventh, the quasi-Poisson model accounts for overdispersion but does not include an explicit autoregressive error term; although the distributed-lag, seasonal, trend and day-of-week controls absorb much short-term temporal autocorrelation, unmodelled residual serial correlation could affect confidence intervals. Eighth, the findings are drawn from the United States and Japan because, among high-income countries with comparably robust road-crash and meteorological data collection, no other country currently provides a fully open, daily, individual-level crash record equivalent to FARS or the Japanese NPA open data; the EU CARE database contains detailed individual accident records but is not publicly available at the daily individual level, and national open road-safety datasets in Europe are not harmonised, so the United States and Japan represent the best available public sources for this study design.</w:t>
+        <w:t>Several limitations apply. First, this is an ecological, population-level association: it cannot establish that heat caused illness in any specific crash, and neither FARS nor NPA records post-mortem heat diagnosis. Second, exposure is measured at the state/prefecture level from the nearest GHCN-Daily station; this misclassifies individual exposure and does not capture sub-unit variation such as urban heat islands. We therefore added state population as an offset and evaluated GHCN-derived humidity, heat-index and estimated wet-bulb globe temperature metrics in sensitivity models, but these station-based heat-stress measures still do not measure personal exposure. Third, activity adjustment used national monthly proxies for the main model and annual state VMT for the sensitivity model; neither is daily, mode-specific or shared-mobility-specific, and daily state-level or mode-specific activity could alter the road-user and time-of-day gradients. In particular, publicly available daily national counts of pedestrian, bicycle and shared-mobility trips are not available, so we cannot directly separate a weather-related activity shift from a physiological or mechanical heat effect for those modes. Fourth, the Japanese analysis is an exploratory external validation only; its shorter series, far smaller death counts and sparser GHCN-Daily coverage preclude a precise estimate, and we do not pool the two countries. Fifth, the warming projection is a scenario calculation that holds driving activity, the vehicle fleet and behaviour fixed and assumes the anomaly response is stable under a warmer mean climate; it should be read as illustrative of magnitude, not as a forecast. Sixth, the road-user, age and time-of-day subgroup analyses are exploratory: they entail multiple comparisons without formal adjustment, and the open-air road-user gradient may in part reflect weather-related differences in activity rather than physiology. Seventh, police-reported drinking is incompletely ascertained in FARS, so similar estimates with and without a reported drinking driver do not fully exclude an alcohol-related contribution. Eighth, the quasi-Poisson model accounts for overdispersion but does not include an explicit autoregressive error term; although the distributed-lag, seasonal, trend and day-of-week controls absorb much short-term temporal autocorrelation, unmodelled residual serial correlation could affect confidence intervals. Ninth, the findings are drawn from the United States and Japan because, among high-income countries with comparably robust road-crash and meteorological data collection, no other country currently provides a fully open, daily, individual-level crash record equivalent to FARS or the Japanese NPA open data; the EU CARE database contains detailed individual accident records but is not publicly available at the daily individual level, and national open road-safety datasets in Europe are not harmonised, so the United States and Japan represent the best available public sources for this study design.</w:t>
       </w:r>
       <w:r>
         <w:rPr>

</xml_diff>

<commit_message>
Add Japan accident-type and prefecture-density strata (transit hypothesis test)
- build_jp_strata.py: deaths per prefecture-day by NPA accident type
  (single-vehicle / vehicle-vehicle / vehicle-pedestrian)
- build_jp_density.py: 2020 census population density per prefecture,
  median split as a public-transport availability proxy
- analyze_japan.py: refit anomaly model within each stratum ->
  jp_strata_response.csv; all CIs wide, ordering mirrors US
- fig_jp_strata (Fig 12), Table 8, results + discussion text

Co-Authored-By: Tatsuki Onishi <bougtoir@gmail.com>
</commit_message>
<xml_diff>
--- a/output/manuscript/heat_crash_mortality.docx
+++ b/output/manuscript/heat_crash_mortality.docx
@@ -3027,6 +3027,297 @@
     <w:p/>
     <w:p>
       <w:pPr>
+        <w:spacing w:after="120" w:line="480" w:lineRule="auto"/>
+      </w:pPr>
+      <w:r>
+        <w:t>Within Japan, the same-day estimates were again imprecise, but their ordering descriptively mirrored the US pattern: largest for single-vehicle accidents (RR 1.133 (0.722-1.778)), intermediate for vehicle-vehicle accidents (RR 1.079 (0.731-1.594)), and below one for vehicle-pedestrian accidents (RR 0.740 (0.500-1.097)), consistent with—but far from proving—reduced pedestrian exposure on unusually hot days (Fig. 12; Table 8). Splitting prefectures at the median population density, a proxy for public-transport availability, did not separate the estimates (high-density RR 0.938 (0.696-1.264); low-density RR 0.958 (0.664-1.383)); both confidence intervals are wide and overlap, so the transit-availability hypothesis remains untestable at this sample size.</w:t>
+      </w:r>
+    </w:p>
+    <w:p/>
+    <w:p>
+      <w:pPr>
+        <w:jc w:val="center"/>
+      </w:pPr>
+      <w:r>
+        <w:drawing>
+          <wp:inline xmlns:a="http://schemas.openxmlformats.org/drawingml/2006/main" xmlns:pic="http://schemas.openxmlformats.org/drawingml/2006/picture">
+            <wp:extent cx="5120640" cy="2964581"/>
+            <wp:docPr id="12" name="Picture 12"/>
+            <wp:cNvGraphicFramePr>
+              <a:graphicFrameLocks noChangeAspect="1"/>
+            </wp:cNvGraphicFramePr>
+            <a:graphic>
+              <a:graphicData uri="http://schemas.openxmlformats.org/drawingml/2006/picture">
+                <pic:pic>
+                  <pic:nvPicPr>
+                    <pic:cNvPr id="0" name="fig_jp_strata.png"/>
+                    <pic:cNvPicPr/>
+                  </pic:nvPicPr>
+                  <pic:blipFill>
+                    <a:blip r:embed="rId20"/>
+                    <a:stretch>
+                      <a:fillRect/>
+                    </a:stretch>
+                  </pic:blipFill>
+                  <pic:spPr>
+                    <a:xfrm>
+                      <a:off x="0" y="0"/>
+                      <a:ext cx="5120640" cy="2964581"/>
+                    </a:xfrm>
+                    <a:prstGeom prst="rect"/>
+                  </pic:spPr>
+                </pic:pic>
+              </a:graphicData>
+            </a:graphic>
+          </wp:inline>
+        </w:drawing>
+      </w:r>
+    </w:p>
+    <w:p>
+      <w:pPr>
+        <w:spacing w:before="280"/>
+      </w:pPr>
+      <w:r>
+        <w:rPr>
+          <w:b/>
+        </w:rPr>
+        <w:t xml:space="preserve">Figure 12. </w:t>
+      </w:r>
+      <w:r>
+        <w:t>Japan same-day rate ratio of crash death for a +9 °C anomaly by accident type (single-vehicle, vehicle-vehicle, vehicle-pedestrian) and by prefecture population density (a proxy for public-transport availability, split at the median). All confidence intervals are wide and include the null; these stratified analyses are exploratory and are not adjusted for multiple comparisons.</w:t>
+      </w:r>
+    </w:p>
+    <w:p/>
+    <w:p>
+      <w:pPr>
+        <w:spacing w:before="280"/>
+      </w:pPr>
+      <w:r>
+        <w:rPr>
+          <w:b/>
+        </w:rPr>
+        <w:t xml:space="preserve">Table 8. </w:t>
+      </w:r>
+      <w:r>
+        <w:t>Japan same-day rate ratio of crash death for a +9 °C anomaly, by accident type (NPA classification: single-vehicle, vehicle-vehicle, vehicle-pedestrian; the fatality in a vehicle-pedestrian accident is the struck pedestrian) and by prefecture population density, split at the median as a proxy for public-transport availability. All estimates are underpowered; analyses are exploratory and not adjusted for multiple comparisons.</w:t>
+      </w:r>
+    </w:p>
+    <w:tbl>
+      <w:tblPr>
+        <w:tblStyle w:val="TableGrid"/>
+        <w:tblW w:type="auto" w:w="0"/>
+        <w:tblLook w:firstColumn="1" w:firstRow="1" w:lastColumn="0" w:lastRow="0" w:noHBand="0" w:noVBand="1" w:val="04A0"/>
+      </w:tblPr>
+      <w:tblGrid>
+        <w:gridCol w:w="2880"/>
+        <w:gridCol w:w="2880"/>
+        <w:gridCol w:w="2880"/>
+      </w:tblGrid>
+      <w:tr>
+        <w:tc>
+          <w:tcPr>
+            <w:tcW w:type="dxa" w:w="2880"/>
+          </w:tcPr>
+          <w:p>
+            <w:r>
+              <w:rPr>
+                <w:b/>
+              </w:rPr>
+              <w:t>Stratum</w:t>
+            </w:r>
+          </w:p>
+        </w:tc>
+        <w:tc>
+          <w:tcPr>
+            <w:tcW w:type="dxa" w:w="2880"/>
+          </w:tcPr>
+          <w:p>
+            <w:r>
+              <w:rPr>
+                <w:b/>
+              </w:rPr>
+              <w:t>Crash deaths</w:t>
+            </w:r>
+          </w:p>
+        </w:tc>
+        <w:tc>
+          <w:tcPr>
+            <w:tcW w:type="dxa" w:w="2880"/>
+          </w:tcPr>
+          <w:p>
+            <w:r>
+              <w:rPr>
+                <w:b/>
+              </w:rPr>
+              <w:t>Same-day RR (95% CI)</w:t>
+            </w:r>
+          </w:p>
+        </w:tc>
+      </w:tr>
+      <w:tr>
+        <w:tc>
+          <w:tcPr>
+            <w:tcW w:type="dxa" w:w="2880"/>
+          </w:tcPr>
+          <w:p>
+            <w:r>
+              <w:t>Accident type: Single-vehicle</w:t>
+            </w:r>
+          </w:p>
+        </w:tc>
+        <w:tc>
+          <w:tcPr>
+            <w:tcW w:type="dxa" w:w="2880"/>
+          </w:tcPr>
+          <w:p>
+            <w:r>
+              <w:t>3,227</w:t>
+            </w:r>
+          </w:p>
+        </w:tc>
+        <w:tc>
+          <w:tcPr>
+            <w:tcW w:type="dxa" w:w="2880"/>
+          </w:tcPr>
+          <w:p>
+            <w:r>
+              <w:t>1.133 (0.722-1.778)</w:t>
+            </w:r>
+          </w:p>
+        </w:tc>
+      </w:tr>
+      <w:tr>
+        <w:tc>
+          <w:tcPr>
+            <w:tcW w:type="dxa" w:w="2880"/>
+          </w:tcPr>
+          <w:p>
+            <w:r>
+              <w:t>Accident type: Vehicle-vehicle</w:t>
+            </w:r>
+          </w:p>
+        </w:tc>
+        <w:tc>
+          <w:tcPr>
+            <w:tcW w:type="dxa" w:w="2880"/>
+          </w:tcPr>
+          <w:p>
+            <w:r>
+              <w:t>4,280</w:t>
+            </w:r>
+          </w:p>
+        </w:tc>
+        <w:tc>
+          <w:tcPr>
+            <w:tcW w:type="dxa" w:w="2880"/>
+          </w:tcPr>
+          <w:p>
+            <w:r>
+              <w:t>1.079 (0.731-1.594)</w:t>
+            </w:r>
+          </w:p>
+        </w:tc>
+      </w:tr>
+      <w:tr>
+        <w:tc>
+          <w:tcPr>
+            <w:tcW w:type="dxa" w:w="2880"/>
+          </w:tcPr>
+          <w:p>
+            <w:r>
+              <w:t>Accident type: Vehicle-pedestrian</w:t>
+            </w:r>
+          </w:p>
+        </w:tc>
+        <w:tc>
+          <w:tcPr>
+            <w:tcW w:type="dxa" w:w="2880"/>
+          </w:tcPr>
+          <w:p>
+            <w:r>
+              <w:t>3,968</w:t>
+            </w:r>
+          </w:p>
+        </w:tc>
+        <w:tc>
+          <w:tcPr>
+            <w:tcW w:type="dxa" w:w="2880"/>
+          </w:tcPr>
+          <w:p>
+            <w:r>
+              <w:t>0.740 (0.500-1.097)</w:t>
+            </w:r>
+          </w:p>
+        </w:tc>
+      </w:tr>
+      <w:tr>
+        <w:tc>
+          <w:tcPr>
+            <w:tcW w:type="dxa" w:w="2880"/>
+          </w:tcPr>
+          <w:p>
+            <w:r>
+              <w:t>Prefecture density: High-density prefectures (transit-rich proxy)</w:t>
+            </w:r>
+          </w:p>
+        </w:tc>
+        <w:tc>
+          <w:tcPr>
+            <w:tcW w:type="dxa" w:w="2880"/>
+          </w:tcPr>
+          <w:p>
+            <w:r>
+              <w:t>7,583</w:t>
+            </w:r>
+          </w:p>
+        </w:tc>
+        <w:tc>
+          <w:tcPr>
+            <w:tcW w:type="dxa" w:w="2880"/>
+          </w:tcPr>
+          <w:p>
+            <w:r>
+              <w:t>0.938 (0.696-1.264)</w:t>
+            </w:r>
+          </w:p>
+        </w:tc>
+      </w:tr>
+      <w:tr>
+        <w:tc>
+          <w:tcPr>
+            <w:tcW w:type="dxa" w:w="2880"/>
+          </w:tcPr>
+          <w:p>
+            <w:r>
+              <w:t>Prefecture density: Low-density prefectures (transit-poor proxy)</w:t>
+            </w:r>
+          </w:p>
+        </w:tc>
+        <w:tc>
+          <w:tcPr>
+            <w:tcW w:type="dxa" w:w="2880"/>
+          </w:tcPr>
+          <w:p>
+            <w:r>
+              <w:t>4,081</w:t>
+            </w:r>
+          </w:p>
+        </w:tc>
+        <w:tc>
+          <w:tcPr>
+            <w:tcW w:type="dxa" w:w="2880"/>
+          </w:tcPr>
+          <w:p>
+            <w:r>
+              <w:t>0.958 (0.664-1.383)</w:t>
+            </w:r>
+          </w:p>
+        </w:tc>
+      </w:tr>
+    </w:tbl>
+    <w:p/>
+    <w:p>
+      <w:pPr>
         <w:pStyle w:val="Heading1"/>
       </w:pPr>
       <w:r>
@@ -3052,7 +3343,7 @@
         <w:spacing w:after="120" w:line="480" w:lineRule="auto"/>
       </w:pPr>
       <w:r>
-        <w:t>Two features of the data argue against confounding by overall driving volume and are consistent with a direct heat effect. The excess rose with direct heat exposure: it was small for enclosed, often air-conditioned vehicle occupants but several-fold larger for motorcyclists, pedestrians and cyclists, who are directly exposed and often physically exerting. It was also largest in the hottest hours of the day. Both patterns are consistent with heat degrading psychomotor and cognitive performance. The crash-circumstance strata point the same way: the excess was larger for single-vehicle crashes than for multi-vehicle collisions, persisted on clear days, and was similar whether or not a driver was reported to have been drinking.These gradients are not proof of mechanism, however: open-air travel is itself weather-sensitive, so more motorcycling, cycling and walking on hotter-than-normal days could inflate the open-air estimates through greater exposure rather than physiology, and our activity proxies are national and not mode-specific. Applied to a warmer mean climate, the same exposure-response implies hundreds of additional US crash deaths per year per degree of warming; because these deaths would continue to be coded as ordinary crashes, the societal heat burden they represent would remain uncounted by heat-mortality surveillance.</w:t>
+        <w:t>Two features of the data argue against confounding by overall driving volume and are consistent with a direct heat effect. The excess rose with direct heat exposure: it was small for enclosed, often air-conditioned vehicle occupants but several-fold larger for motorcyclists, pedestrians and cyclists, who are directly exposed and often physically exerting. It was also largest in the hottest hours of the day. Both patterns are consistent with heat degrading psychomotor and cognitive performance. The crash-circumstance strata point the same way: the excess was larger for single-vehicle crashes than for multi-vehicle collisions, persisted on clear days, and was similar whether or not a driver was reported to have been drinking. The Japanese strata, although very imprecise, point the same way: the single-vehicle estimate was again the largest and the vehicle-pedestrian point estimate fell below one, the ordering expected if hot days both degrade vehicle control and reduce pedestrian exposure.These gradients are not proof of mechanism, however: open-air travel is itself weather-sensitive, so more motorcycling, cycling and walking on hotter-than-normal days could inflate the open-air estimates through greater exposure rather than physiology, and our activity proxies are national and not mode-specific. Applied to a warmer mean climate, the same exposure-response implies hundreds of additional US crash deaths per year per degree of warming; because these deaths would continue to be coded as ordinary crashes, the societal heat burden they represent would remain uncounted by heat-mortality surveillance.</w:t>
       </w:r>
     </w:p>
     <w:p>
@@ -3068,7 +3359,7 @@
         <w:spacing w:after="120" w:line="480" w:lineRule="auto"/>
       </w:pPr>
       <w:r>
-        <w:t>These results point to practical implications for road safety and climate adaptation. Because the same-day excess was largest among open-air road users and in the hottest hours, heat warnings and travel advice could be targeted at motorcyclists, cyclists, pedestrians and outdoor delivery riders during hot periods. Shared e-scooter and e-bike fleets and public bikeshare systems should also be considered: their batteries, motors and tyres are heat-stressed and may become prone to sudden power loss or brake failure in hot weather, while docking and charging points without shade expose users and maintenance staff to thermal load during check-out, parking and battery swap. Service operators could temporarily reduce or suspend rentals above high-temperature thresholds, relocate or shade docking and charging infrastructure, and integrate heat warnings into app-based routing. Linking shared-mobility heat alerts with public transit and cooled shelter maps would help preserve access for users who depend on these modes, particularly in low-income neighbourhoods where private air-conditioned transport is less available. Road safety agencies typically classify fatal crashes by driver error, vehicle failure or road conditions; the possibility that ambient heat impairs psychomotor or cognitive performance is rarely considered. Integrating temperature forecasts into crash-prevention messaging and ensuring heat-health plans reach outdoor workers and commuters is consistent with a Safe System approach to environmental risk and could reduce a burden that is currently invisible to both heat-mortality and road-safety surveillance, though intervention studies are needed to test whether such heat-aware measures reduce crash risk.</w:t>
+        <w:t>These results point to practical implications for road safety and climate adaptation. Because the same-day excess was largest among open-air road users and in the hottest hours, heat warnings and travel advice could be targeted at motorcyclists, cyclists, pedestrians and outdoor delivery riders during hot periods. Shared e-scooter and e-bike fleets and public bikeshare systems should also be considered: their batteries, motors and tyres are heat-stressed and may become prone to sudden power loss or brake failure in hot weather, while docking and charging points without shade expose users and maintenance staff to thermal load during check-out, parking and battery swap. Service operators could temporarily reduce or suspend rentals above high-temperature thresholds, relocate or shade docking and charging infrastructure, and integrate heat warnings into app-based routing. Linking shared-mobility heat alerts with public transit and cooled shelter maps would help preserve access for users who depend on these modes, particularly in low-income neighbourhoods where private air-conditioned transport is less available. The Japanese data also raise the possibility of modal substitution: where cooled public transit offers an alternative, unusually hot days may suppress walking and riding rather than generate excess crash deaths. In the US, where such alternatives are limited, safe transit options could plausibly prevent part of the heat-associated burden; our prefecture-density split was too imprecise to test this and the hypothesis remains open. Road safety agencies typically classify fatal crashes by driver error, vehicle failure or road conditions; the possibility that ambient heat impairs psychomotor or cognitive performance is rarely considered. Integrating temperature forecasts into crash-prevention messaging and ensuring heat-health plans reach outdoor workers and commuters is consistent with a Safe System approach to environmental risk and could reduce a burden that is currently invisible to both heat-mortality and road-safety surveillance, though intervention studies are needed to test whether such heat-aware measures reduce crash risk.</w:t>
       </w:r>
     </w:p>
     <w:p>

</xml_diff>

<commit_message>
Reframe for JSR fit: road-safety-hazard intro, weaker Fig 4 caption, drop untested vehicle-failure claims
Co-Authored-By: Tatsuki Onishi <bougtoir@gmail.com>
</commit_message>
<xml_diff>
--- a/output/manuscript/heat_crash_mortality.docx
+++ b/output/manuscript/heat_crash_mortality.docx
@@ -179,7 +179,7 @@
         <w:spacing w:after="120" w:line="480" w:lineRule="auto"/>
       </w:pPr>
       <w:r>
-        <w:t>Road traffic crashes are a leading cause of preventable death, and climate change is adding a heat-related layer of risk. Heat waves are becoming more frequent, and ambient heat is an established driver of mortality.</w:t>
+        <w:t>Road traffic crashes are a leading cause of preventable death, and climate change is adding a heat-related layer of risk. Ambient heat is an established driver of mortality.</w:t>
       </w:r>
       <w:r>
         <w:rPr>
@@ -188,16 +188,25 @@
         <w:t>1,2</w:t>
       </w:r>
       <w:r>
-        <w:t xml:space="preserve"> Recent syntheses also link higher ambient temperature to increased road traffic accidents and injuries.</w:t>
+        <w:t xml:space="preserve"> Driving, riding and walking nonetheless continue in hot weather, and heat degrades psychomotor and cognitive performance.</w:t>
       </w:r>
       <w:r>
         <w:rPr>
           <w:vertAlign w:val="superscript"/>
         </w:rPr>
-        <w:t>3,4</w:t>
+        <w:t>3</w:t>
       </w:r>
       <w:r>
-        <w:t xml:space="preserve"> Occupational and driving activity do not stop during heat, so some fatal accidents plausibly involve heat-related impairment or overt heat illness. Traffic-crash deaths are of particular interest because decedents rarely undergo the post-mortem assessment that would identify a heat contribution, so any such contribution would be largely invisible in routine cause-of-death coding. We therefore ask whether days that are hotter than the local seasonal norm carry excess traffic-crash mortality, and how the magnitude compares with officially recorded direct-heat deaths. This is an ecological, population-level study whose aim is to gauge the potential societal burden of under-recognised heat illness—the deaths that would be missing from official heat statistics—rather than to diagnose heat illness in any individual crash. If population-level heat contributes to road deaths, heat-aware road safety messaging and occupational protections for outdoor riders and drivers could reduce a burden currently invisible to both heat-mortality and road-safety surveillance.</w:t>
+        <w:t xml:space="preserve"> Ambient heat is therefore plausibly an under-recognised road-safety hazard: a crash-risk condition that agencies do not currently monitor, warn against or mitigate. Recent syntheses link higher ambient temperature to increased road traffic accidents and injuries,</w:t>
+      </w:r>
+      <w:r>
+        <w:rPr>
+          <w:vertAlign w:val="superscript"/>
+        </w:rPr>
+        <w:t>4,5</w:t>
+      </w:r>
+      <w:r>
+        <w:t xml:space="preserve"> but fatal crashes have rarely been examined as a heat-related safety outcome in their own right. We therefore ask whether days that are hotter than the local seasonal norm carry excess traffic-crash mortality, which road users are most affected, and whether the circumstances of the excess crashes are consistent with a heat-impairment mechanism. One corollary is surveillance: because crash decedents rarely undergo post-mortem assessment for a heat contribution, any such contribution would be invisible in routine cause-of-death coding, so we also compare the magnitude with officially recorded direct-heat deaths. If ambient heat is a road-safety hazard, heat-aware crash-prevention messaging and protections for outdoor riders and drivers could reduce a burden currently invisible to both heat-mortality and road-safety surveillance.</w:t>
       </w:r>
     </w:p>
     <w:p>
@@ -219,7 +228,7 @@
         <w:rPr>
           <w:vertAlign w:val="superscript"/>
         </w:rPr>
-        <w:t>5</w:t>
+        <w:t>6</w:t>
       </w:r>
       <w:r>
         <w:t xml:space="preserve"> and by Japanese prefecture (National Police Agency [NPA] accident open data, 2019-2024).</w:t>
@@ -228,7 +237,7 @@
         <w:rPr>
           <w:vertAlign w:val="superscript"/>
         </w:rPr>
-        <w:t>6</w:t>
+        <w:t>7</w:t>
       </w:r>
       <w:r>
         <w:t xml:space="preserve"> Daily mean temperature was taken from the Global Historical Climatology Network-Daily (GHCN-Daily) stations</w:t>
@@ -237,7 +246,7 @@
         <w:rPr>
           <w:vertAlign w:val="superscript"/>
         </w:rPr>
-        <w:t>7</w:t>
+        <w:t>8</w:t>
       </w:r>
       <w:r>
         <w:t xml:space="preserve"> as the mean of TMAX and TMIN, aggregated to each spatial unit from its nearest reporting stations. State-level precipitation (PRCP) and, in sensitivity analyses, daily average dew point (ADPT), relative humidity (RHAV) and average wet-bulb temperature (AWBT) were taken from the same GHCN-Daily stations and used to compute humidex, the US National Weather Service heat index (converted back to degrees Celsius) and an estimated wet-bulb globe temperature (0.7 times wet-bulb plus 0.3 times air temperature). For every unit we estimated a cyclic day-of-year climatology and defined the temperature anomaly as the observed temperature minus that climatology,</w:t>
@@ -338,7 +347,7 @@
         <w:rPr>
           <w:vertAlign w:val="superscript"/>
         </w:rPr>
-        <w:t>8</w:t>
+        <w:t>9</w:t>
       </w:r>
       <w:r>
         <w:t xml:space="preserve"> of the form</w:t>
@@ -490,7 +499,7 @@
         <w:rPr>
           <w:vertAlign w:val="superscript"/>
         </w:rPr>
-        <w:t>9</w:t>
+        <w:t>10</w:t>
       </w:r>
       <w:r>
         <w:t xml:space="preserve"> with Monte Carlo (MC) confidence intervals (CIs). As sensitivity analyses for the US we added (i) national vehicle-miles travelled (VMT)</w:t>
@@ -499,7 +508,7 @@
         <w:rPr>
           <w:vertAlign w:val="superscript"/>
         </w:rPr>
-        <w:t>10</w:t>
+        <w:t>11</w:t>
       </w:r>
       <w:r>
         <w:t xml:space="preserve"> and finished-motor-gasoline product supplied</w:t>
@@ -508,7 +517,7 @@
         <w:rPr>
           <w:vertAlign w:val="superscript"/>
         </w:rPr>
-        <w:t>11</w:t>
+        <w:t>12</w:t>
       </w:r>
       <w:r>
         <w:t xml:space="preserve"> as activity proxies, and (ii) a richer control set with state annual population entered as a log offset</w:t>
@@ -517,7 +526,7 @@
         <w:rPr>
           <w:vertAlign w:val="superscript"/>
         </w:rPr>
-        <w:t>12</w:t>
+        <w:t>13</w:t>
       </w:r>
       <w:r>
         <w:t>, state annual VMT</w:t>
@@ -526,7 +535,7 @@
         <w:rPr>
           <w:vertAlign w:val="superscript"/>
         </w:rPr>
-        <w:t>13</w:t>
+        <w:t>14</w:t>
       </w:r>
       <w:r>
         <w:t xml:space="preserve"> and daily state precipitation, all as z-scored linear terms except the population offset, plus GHCN-derived heat-stress metrics (humidex, NOAA heat index, and an estimated wet-bulb globe temperature) expressed as anomalies relative to their day-of-year climatology. Because heat-stress metrics are functions of temperature and can be collinear with the anomaly exposure, we selected the primary full-controls model by a variance-inflation-factor (VIF) screen (iteratively dropping added controls with VIF &gt; 10). A stricter VIF &lt; 5 screen and an unscreened model retaining all candidate controls were also fitted and reported as sensitivity analyses. Heat-stress metrics were tested individually because they are functions of temperature. State fixed effects capture time-invariant cross-state differences in baseline risk, while the log-population offset scales expected counts within each state across years; because state annual VMT is correlated with population size, the two partly adjust for the same scale factor, so their simultaneous use is reported as a sensitivity analysis rather than the primary specification. Officially recorded direct-heat deaths (International Classification of Diseases, 10th revision [ICD-10] code X30) were obtained from CDC WONDER.</w:t>
@@ -535,7 +544,7 @@
         <w:rPr>
           <w:vertAlign w:val="superscript"/>
         </w:rPr>
-        <w:t>14</w:t>
+        <w:t>15</w:t>
       </w:r>
       <w:r>
         <w:t xml:space="preserve"> We performed three further US analyses: (i) refitting the same-day model within crash-hour bands to test whether the excess concentrates in the hottest hours; (ii) refitting it by road-user type (vehicle occupant, motorcyclist, pedestrian, cyclist), age band and crash circumstances (manner of collision, weather condition, rural/urban land use and police-reported driver drinking) from FARS records, as mechanistic and vulnerability analyses; and (iii) projecting the additional crash deaths under uniform warming scenarios of the daily temperature distribution (+1, +2, +3 °C), holding activity and baseline rates constant. All data are public and the full pipeline is reproducible from source (see Data availability). Reporting follows the Strengthening the Reporting of Observational Studies in Epidemiology (STROBE) guideline (checklist provided).</w:t>
@@ -1164,7 +1173,7 @@
         <w:rPr>
           <w:vertAlign w:val="superscript"/>
         </w:rPr>
-        <w:t>15</w:t>
+        <w:t>3</w:t>
       </w:r>
       <w:r>
         <w:t xml:space="preserve"> This gradient could also partly reflect greater discretionary open-air travel (motorcycling, cycling, walking) on hotter-than-normal days, which our aggregate activity proxies do not capture by mode. Across age bands the excess was similar: age &lt;25 y RR 1.123 (1.059-1.190); 25-64 y RR 1.176 (1.139-1.215); 65+ y RR 1.176 (1.113-1.242) (Table 3), giving no clear age gradient. Second, the excess was largest for crashes in the hottest part of the day (12-17 h), RR 1.217 (1.160-1.276), and weakest in the cool morning (06-11 h), RR 1.062 (1.001-1.127); the overnight band was also elevated (00-05 h), RR 1.176 (1.108-1.249), so the diurnal pattern is not a clean daytime-only gradient (Fig. 5). These subgroup analyses are hypothesis-generating: they involve multiple unadjusted comparisons and are not individual-level tests of susceptibility or mechanism.</w:t>
@@ -1221,7 +1230,7 @@
         <w:t xml:space="preserve">Figure 4. </w:t>
       </w:r>
       <w:r>
-        <w:t>United States same-day rate ratio of crash death for a +9 °C anomaly by road-user type. Open-air users (motorcyclists, pedestrians, cyclists) show much larger heat effects than enclosed, often air-conditioned, vehicle occupants—a gradient that tracks direct heat exposure rather than driving volume. This subgroup analysis is exploratory and is not adjusted for multiple comparisons.</w:t>
+        <w:t>United States same-day rate ratio of crash death for a +9 °C anomaly by road-user type. Open-air users (motorcyclists, pedestrians, cyclists) show much larger heat effects than enclosed, often air-conditioned, vehicle occupants—a gradient consistent with greater direct heat exposure, although mode-specific activity changes on hot days cannot be excluded. This subgroup analysis is exploratory and is not adjusted for multiple comparisons.</w:t>
       </w:r>
     </w:p>
     <w:p/>
@@ -3335,7 +3344,7 @@
         <w:rPr>
           <w:vertAlign w:val="superscript"/>
         </w:rPr>
-        <w:t>3,4</w:t>
+        <w:t>4,5</w:t>
       </w:r>
     </w:p>
     <w:p>
@@ -3359,7 +3368,7 @@
         <w:spacing w:after="120" w:line="480" w:lineRule="auto"/>
       </w:pPr>
       <w:r>
-        <w:t>These results point to practical implications for road safety and climate adaptation. Because the same-day excess was largest among open-air road users and in the hottest hours, heat warnings and travel advice could be targeted at motorcyclists, cyclists, pedestrians and outdoor delivery riders during hot periods. Shared e-scooter and e-bike fleets and public bikeshare systems should also be considered: their batteries, motors and tyres are heat-stressed and may become prone to sudden power loss or brake failure in hot weather, while docking and charging points without shade expose users and maintenance staff to thermal load during check-out, parking and battery swap. Service operators could temporarily reduce or suspend rentals above high-temperature thresholds, relocate or shade docking and charging infrastructure, and integrate heat warnings into app-based routing. Linking shared-mobility heat alerts with public transit and cooled shelter maps would help preserve access for users who depend on these modes, particularly in low-income neighbourhoods where private air-conditioned transport is less available. The Japanese data also raise the possibility of modal substitution: where cooled public transit offers an alternative, unusually hot days may suppress walking and riding rather than generate excess crash deaths. In the US, where such alternatives are limited, safe transit options could plausibly prevent part of the heat-associated burden; our prefecture-density split was too imprecise to test this and the hypothesis remains open. Road safety agencies typically classify fatal crashes by driver error, vehicle failure or road conditions; the possibility that ambient heat impairs psychomotor or cognitive performance is rarely considered. Integrating temperature forecasts into crash-prevention messaging and ensuring heat-health plans reach outdoor workers and commuters is consistent with a Safe System approach to environmental risk and could reduce a burden that is currently invisible to both heat-mortality and road-safety surveillance, though intervention studies are needed to test whether such heat-aware measures reduce crash risk.</w:t>
+        <w:t>These results point to practical implications for road safety and climate adaptation. Because the same-day excess was largest among open-air road users and in the hottest hours, heat warnings and travel advice could be targeted at motorcyclists, cyclists, pedestrians and outdoor delivery riders during hot periods. Shared e-scooter, e-bike and public bikeshare users are directly exposed open-air riders, and unshaded docking and charging points add thermal load during check-out and parking, so operators could integrate heat warnings into app-based routing and consider shade for docking infrastructure. Linking shared-mobility heat alerts with public transit and cooled shelter maps would help preserve access for users who depend on these modes, particularly in low-income neighbourhoods where private air-conditioned transport is less available. The Japanese data also raise the possibility of modal substitution: where cooled public transit offers an alternative, unusually hot days may suppress walking and riding rather than generate excess crash deaths. In the US, where such alternatives are limited, safe transit options could plausibly prevent part of the heat-associated burden; our prefecture-density split was too imprecise to test this and the hypothesis remains open. Road safety agencies typically classify fatal crashes by driver error, vehicle failure or road conditions; the possibility that ambient heat impairs psychomotor or cognitive performance is rarely considered. Integrating temperature forecasts into crash-prevention messaging and ensuring heat-health plans reach outdoor workers and commuters is consistent with a Safe System approach to environmental risk and could reduce a burden that is currently invisible to both heat-mortality and road-safety surveillance, though intervention studies are needed to test whether such heat-aware measures reduce crash risk.</w:t>
       </w:r>
     </w:p>
     <w:p>
@@ -3504,7 +3513,7 @@
         <w:spacing w:after="80"/>
       </w:pPr>
       <w:r>
-        <w:t>3. Liang M, Min M, Guo X, Song Q, Wang H, Li N, et al. The relationship between ambient temperatures and road traffic injuries: a systematic review and meta-analysis. Environ Sci Pollut Res 2022;29(33):50647-60.</w:t>
+        <w:t>3. Daanen HAM, van de Vliert E, Huang X. Driving performance in cold, warm, and thermoneutral environments. Appl Ergon 2003;34:597-602.</w:t>
       </w:r>
     </w:p>
     <w:p>
@@ -3512,7 +3521,7 @@
         <w:spacing w:after="80"/>
       </w:pPr>
       <w:r>
-        <w:t>4. Liang M, Zhao D, Wu Y, Ye P, Wang Y, Yao Z, et al. Short-term effects of ambient temperature and road traffic accident injuries in Dalian, Northern China: A distributed lag non-linear analysis. Accid Anal Prev 2021;153:106057.</w:t>
+        <w:t>4. Liang M, Min M, Guo X, Song Q, Wang H, Li N, et al. The relationship between ambient temperatures and road traffic injuries: a systematic review and meta-analysis. Environ Sci Pollut Res 2022;29(33):50647-60.</w:t>
       </w:r>
     </w:p>
     <w:p>
@@ -3520,7 +3529,7 @@
         <w:spacing w:after="80"/>
       </w:pPr>
       <w:r>
-        <w:t>5. National Highway Traffic Safety Administration. Fatality Analysis Reporting System (FARS). US Department of Transportation. https://www.nhtsa.gov/research-data/fatality-analysis-reporting-system-fars</w:t>
+        <w:t>5. Liang M, Zhao D, Wu Y, Ye P, Wang Y, Yao Z, et al. Short-term effects of ambient temperature and road traffic accident injuries in Dalian, Northern China: A distributed lag non-linear analysis. Accid Anal Prev 2021;153:106057.</w:t>
       </w:r>
     </w:p>
     <w:p>
@@ -3528,7 +3537,7 @@
         <w:spacing w:after="80"/>
       </w:pPr>
       <w:r>
-        <w:t>6. National Police Agency of Japan. Traffic accident statistics open data. https://www.npa.go.jp/publications/statistics/koutsuu/opendata/</w:t>
+        <w:t>6. National Highway Traffic Safety Administration. Fatality Analysis Reporting System (FARS). US Department of Transportation. https://www.nhtsa.gov/research-data/fatality-analysis-reporting-system-fars</w:t>
       </w:r>
     </w:p>
     <w:p>
@@ -3536,7 +3545,7 @@
         <w:spacing w:after="80"/>
       </w:pPr>
       <w:r>
-        <w:t>7. Menne MJ, Durre I, Vose RS, Gleason BE, Houston TG. An overview of the Global Historical Climatology Network-Daily database. J Atmos Ocean Technol 2012;29:897-910.</w:t>
+        <w:t>7. National Police Agency of Japan. Traffic accident statistics open data. https://www.npa.go.jp/publications/statistics/koutsuu/opendata/</w:t>
       </w:r>
     </w:p>
     <w:p>
@@ -3544,7 +3553,7 @@
         <w:spacing w:after="80"/>
       </w:pPr>
       <w:r>
-        <w:t>8. Gasparrini A, Armstrong B, Kenward MG. Distributed lag non-linear models. Stat Med 2010;29:2224-34.</w:t>
+        <w:t>8. Menne MJ, Durre I, Vose RS, Gleason BE, Houston TG. An overview of the Global Historical Climatology Network-Daily database. J Atmos Ocean Technol 2012;29:897-910.</w:t>
       </w:r>
     </w:p>
     <w:p>
@@ -3552,7 +3561,7 @@
         <w:spacing w:after="80"/>
       </w:pPr>
       <w:r>
-        <w:t>9. Gasparrini A, Leone M. Attributable risk from distributed lag models. BMC Med Res Methodol 2014;14:55.</w:t>
+        <w:t>9. Gasparrini A, Armstrong B, Kenward MG. Distributed lag non-linear models. Stat Med 2010;29:2224-34.</w:t>
       </w:r>
     </w:p>
     <w:p>
@@ -3560,7 +3569,7 @@
         <w:spacing w:after="80"/>
       </w:pPr>
       <w:r>
-        <w:t>10. Federal Highway Administration. Traffic Volume Trends. https://www.fhwa.dot.gov/policyinformation/travel_monitoring/tvt.cfm</w:t>
+        <w:t>10. Gasparrini A, Leone M. Attributable risk from distributed lag models. BMC Med Res Methodol 2014;14:55.</w:t>
       </w:r>
     </w:p>
     <w:p>
@@ -3568,7 +3577,7 @@
         <w:spacing w:after="80"/>
       </w:pPr>
       <w:r>
-        <w:t>11. US Energy Information Administration. Weekly finished motor gasoline product supplied (PET.WGFUPUS2.W). https://www.eia.gov/</w:t>
+        <w:t>11. Federal Highway Administration. Traffic Volume Trends. https://www.fhwa.dot.gov/policyinformation/travel_monitoring/tvt.cfm</w:t>
       </w:r>
     </w:p>
     <w:p>
@@ -3576,7 +3585,7 @@
         <w:spacing w:after="80"/>
       </w:pPr>
       <w:r>
-        <w:t>12. US Census Bureau. Population Estimates Program. Annual state population estimates. https://www.census.gov/programs-surveys/popest.html</w:t>
+        <w:t>12. US Energy Information Administration. Weekly finished motor gasoline product supplied (PET.WGFUPUS2.W). https://www.eia.gov/</w:t>
       </w:r>
     </w:p>
     <w:p>
@@ -3584,7 +3593,7 @@
         <w:spacing w:after="80"/>
       </w:pPr>
       <w:r>
-        <w:t>13. Federal Highway Administration. Highway Statistics VM-2: Annual state vehicle-miles travelled. https://www.fhwa.dot.gov/policyinformation/statistics.cfm</w:t>
+        <w:t>13. US Census Bureau. Population Estimates Program. Annual state population estimates. https://www.census.gov/programs-surveys/popest.html</w:t>
       </w:r>
     </w:p>
     <w:p>
@@ -3592,7 +3601,7 @@
         <w:spacing w:after="80"/>
       </w:pPr>
       <w:r>
-        <w:t>14. Centers for Disease Control and Prevention. CDC WONDER Underlying Cause of Death database. https://wonder.cdc.gov/</w:t>
+        <w:t>14. Federal Highway Administration. Highway Statistics VM-2: Annual state vehicle-miles travelled. https://www.fhwa.dot.gov/policyinformation/statistics.cfm</w:t>
       </w:r>
     </w:p>
     <w:p>
@@ -3600,7 +3609,7 @@
         <w:spacing w:after="80"/>
       </w:pPr>
       <w:r>
-        <w:t>15. Daanen HAM, van de Vliert E, Huang X. Driving performance in cold, warm, and thermoneutral environments. Appl Ergon 2003;34:597-602.</w:t>
+        <w:t>15. Centers for Disease Control and Prevention. CDC WONDER Underlying Cause of Death database. https://wonder.cdc.gov/</w:t>
       </w:r>
     </w:p>
     <w:p>

</xml_diff>

<commit_message>
Add DST-transition exclusion sensitivity analysis (US model)
Co-Authored-By: Tatsuki Onishi <bougtoir@gmail.com>
</commit_message>
<xml_diff>
--- a/output/manuscript/heat_crash_mortality.docx
+++ b/output/manuscript/heat_crash_mortality.docx
@@ -2403,7 +2403,7 @@
         <w:spacing w:after="120" w:line="480" w:lineRule="auto"/>
       </w:pPr>
       <w:r>
-        <w:t>Sensitivity to activity, precipitation and heat-stress controls is summarized in Table 7. All added continuous terms were z-scored linear terms; state population entered as a log offset, and heat-stress metrics were expressed as anomalies relative to their day-of-year climatology. The primary full-controls model was selected by iteratively removing added controls with VIF &gt; 10; dropped variables were vmt_state (VIF=323.8); humidex_anom (VIF=63.5); heat_index_anom (VIF=24.5). A stricter VIF &lt; 5 screen and an unscreened full-controls model are also shown. Heat-stress metrics showed high collinearity with the temperature anomaly when entered individually, so they are reported separately as sensitivity analyses rather than being included simultaneously.</w:t>
+        <w:t>Sensitivity to activity, precipitation and heat-stress controls is summarized in Table 7. All added continuous terms were z-scored linear terms; state population entered as a log offset, and heat-stress metrics were expressed as anomalies relative to their day-of-year climatology. The primary full-controls model was selected by iteratively removing added controls with VIF &gt; 10; dropped variables were vmt_state (VIF=323.8); humidex_anom (VIF=63.5); heat_index_anom (VIF=24.5). A stricter VIF &lt; 5 screen and an unscreened full-controls model are also shown. Heat-stress metrics showed high collinearity with the temperature anomaly when entered individually, so they are reported separately as sensitivity analyses rather than being included simultaneously. Because crash spikes have been reported around daylight-saving-time transitions, we additionally refit the model excluding all state-days within 7 days of each US clock change; the estimate was unchanged (same-day RR 1.166 (1.136-1.197)).</w:t>
       </w:r>
     </w:p>
     <w:p>
@@ -2902,6 +2902,48 @@
           <w:p>
             <w:r>
               <w:t>323.8</w:t>
+            </w:r>
+          </w:p>
+        </w:tc>
+      </w:tr>
+      <w:tr>
+        <w:tc>
+          <w:tcPr>
+            <w:tcW w:type="dxa" w:w="2160"/>
+          </w:tcPr>
+          <w:p>
+            <w:r>
+              <w:t>Excluding +/-7 d around DST transitions</w:t>
+            </w:r>
+          </w:p>
+        </w:tc>
+        <w:tc>
+          <w:tcPr>
+            <w:tcW w:type="dxa" w:w="2160"/>
+          </w:tcPr>
+          <w:p>
+            <w:r>
+              <w:t>1.166 (1.136-1.197)</w:t>
+            </w:r>
+          </w:p>
+        </w:tc>
+        <w:tc>
+          <w:tcPr>
+            <w:tcW w:type="dxa" w:w="2160"/>
+          </w:tcPr>
+          <w:p>
+            <w:r>
+              <w:t>1.072 (1.012-1.135)</w:t>
+            </w:r>
+          </w:p>
+        </w:tc>
+        <w:tc>
+          <w:tcPr>
+            <w:tcW w:type="dxa" w:w="2160"/>
+          </w:tcPr>
+          <w:p>
+            <w:r>
+              <w:t>-</w:t>
             </w:r>
           </w:p>
         </w:tc>

</xml_diff>

<commit_message>
Fix spacing typo and align limitations wording with human-exposure framing
Co-Authored-By: Tatsuki Onishi <bougtoir@gmail.com>
</commit_message>
<xml_diff>
--- a/output/manuscript/heat_crash_mortality.docx
+++ b/output/manuscript/heat_crash_mortality.docx
@@ -3394,7 +3394,7 @@
         <w:spacing w:after="120" w:line="480" w:lineRule="auto"/>
       </w:pPr>
       <w:r>
-        <w:t>Two features of the data are not readily explained by overall driving volume alone and are consistent with a direct heat effect. The excess rose with direct heat exposure: it was small for enclosed, often air-conditioned vehicle occupants but several-fold larger for motorcyclists, pedestrians and cyclists, who are directly exposed and often physically exerting. It was also largest in the hottest hours of the day. Both patterns are consistent with heat degrading psychomotor and cognitive performance. The crash-circumstance strata point the same way: the excess was larger for single-vehicle crashes than for multi-vehicle collisions, persisted on clear days, and was similar whether or not a driver was reported to have been drinking. The Japanese strata, although very imprecise, point the same way: the single-vehicle estimate was again the largest and the vehicle-pedestrian point estimate fell below one, the ordering expected if hot days both degrade vehicle control and reduce pedestrian exposure.These gradients are not proof of mechanism, however: open-air travel is itself weather-sensitive, so more motorcycling, cycling and walking on hotter-than-normal days could inflate the open-air estimates through greater exposure rather than physiology, and our activity proxies are national and not mode-specific. Applied to a warmer mean climate, the same exposure-response implies hundreds of additional US crash deaths per year per degree of warming; because these deaths would continue to be coded as ordinary crashes, the societal heat burden they represent would remain uncounted by heat-mortality surveillance.</w:t>
+        <w:t>Two features of the data are not readily explained by overall driving volume alone and are consistent with a direct heat effect. The excess rose with direct heat exposure: it was small for enclosed, often air-conditioned vehicle occupants but several-fold larger for motorcyclists, pedestrians and cyclists, who are directly exposed and often physically exerting. It was also largest in the hottest hours of the day. Both patterns are consistent with heat degrading psychomotor and cognitive performance. The crash-circumstance strata point the same way: the excess was larger for single-vehicle crashes than for multi-vehicle collisions, persisted on clear days, and was similar whether or not a driver was reported to have been drinking. The Japanese strata, although very imprecise, point the same way: the single-vehicle estimate was again the largest and the vehicle-pedestrian point estimate fell below one, the ordering expected if hot days both degrade vehicle control and reduce pedestrian exposure. These gradients are not proof of mechanism, however: open-air travel is itself weather-sensitive, so more motorcycling, cycling and walking on hotter-than-normal days could inflate the open-air estimates through greater exposure rather than physiology, and our activity proxies are national and not mode-specific. Applied to a warmer mean climate, the same exposure-response implies hundreds of additional US crash deaths per year per degree of warming; because these deaths would continue to be coded as ordinary crashes, the societal heat burden they represent would remain uncounted by heat-mortality surveillance.</w:t>
       </w:r>
     </w:p>
     <w:p>
@@ -3418,7 +3418,7 @@
         <w:spacing w:after="120" w:line="480" w:lineRule="auto"/>
       </w:pPr>
       <w:r>
-        <w:t>Several limitations apply. First, this is an ecological, population-level association: it cannot establish that heat caused illness in any specific crash, and neither FARS nor NPA records post-mortem heat diagnosis. Second, exposure is measured at the state/prefecture level from the nearest GHCN-Daily station; this misclassifies individual exposure and does not capture sub-unit variation such as urban heat islands. We therefore added state population as an offset and evaluated GHCN-derived humidity, heat-index and estimated wet-bulb globe temperature metrics in sensitivity models, but these station-based heat-stress measures still do not measure personal exposure. Third, activity adjustment used national monthly proxies for the main model and annual state VMT for the sensitivity model; neither is daily, mode-specific or shared-mobility-specific, and daily state-level or mode-specific activity could alter the road-user and time-of-day gradients. In particular, publicly available daily national counts of pedestrian, bicycle and shared-mobility trips are not available, so we cannot directly separate a weather-related activity shift from a physiological or mechanical heat effect for those modes. Fourth, the Japanese analysis is an exploratory external validation only; its shorter series, far smaller death counts and sparser GHCN-Daily coverage preclude a precise estimate, and we do not pool the two countries. Fifth, the warming projection is a scenario calculation that holds driving activity, the vehicle fleet and behaviour fixed and assumes the anomaly response is stable under a warmer mean climate; it should be read as illustrative of magnitude, not as a forecast. Sixth, the road-user, age and time-of-day subgroup analyses are exploratory: they entail multiple comparisons without formal adjustment, and the open-air road-user gradient may in part reflect weather-related differences in activity rather than physiology. Seventh, police-reported drinking is incompletely ascertained in FARS, so similar estimates with and without a reported drinking driver do not fully exclude an alcohol-related contribution. Eighth, the quasi-Poisson model accounts for overdispersion but does not include an explicit autoregressive error term; although the distributed-lag, seasonal, trend and day-of-week controls absorb much short-term temporal autocorrelation, unmodelled residual serial correlation could affect confidence intervals. Ninth, the findings are drawn from the United States and Japan because, among high-income countries with comparably robust road-crash and meteorological data collection, no other country currently provides a fully open, daily, individual-level crash record equivalent to FARS or the Japanese NPA open data; the EU CARE database contains detailed individual accident records but is not publicly available at the daily individual level, and national open road-safety datasets in Europe are not harmonised, so the United States and Japan represent the best available public sources for this study design.</w:t>
+        <w:t>Several limitations apply. First, this is an ecological, population-level association: it cannot establish that heat caused illness in any specific crash, and neither FARS nor NPA records post-mortem heat diagnosis. Second, exposure is measured at the state/prefecture level from the nearest GHCN-Daily station; this misclassifies individual exposure and does not capture sub-unit variation such as urban heat islands. We therefore added state population as an offset and evaluated GHCN-derived humidity, heat-index and estimated wet-bulb globe temperature metrics in sensitivity models, but these station-based heat-stress measures still do not measure personal exposure. Third, activity adjustment used national monthly proxies for the main model and annual state VMT for the sensitivity model; neither is daily, mode-specific or shared-mobility-specific, and daily state-level or mode-specific activity could alter the road-user and time-of-day gradients. In particular, publicly available daily national counts of pedestrian, bicycle and shared-mobility trips are not available, so we cannot directly separate a weather-related activity shift from a physiological heat effect or other heat-related mechanisms for those modes. Fourth, the Japanese analysis is an exploratory external validation only; its shorter series, far smaller death counts and sparser GHCN-Daily coverage preclude a precise estimate, and we do not pool the two countries. Fifth, the warming projection is a scenario calculation that holds driving activity, the vehicle fleet and behaviour fixed and assumes the anomaly response is stable under a warmer mean climate; it should be read as illustrative of magnitude, not as a forecast. Sixth, the road-user, age and time-of-day subgroup analyses are exploratory: they entail multiple comparisons without formal adjustment, and the open-air road-user gradient may in part reflect weather-related differences in activity rather than physiology. Seventh, police-reported drinking is incompletely ascertained in FARS, so similar estimates with and without a reported drinking driver do not fully exclude an alcohol-related contribution. Eighth, the quasi-Poisson model accounts for overdispersion but does not include an explicit autoregressive error term; although the distributed-lag, seasonal, trend and day-of-week controls absorb much short-term temporal autocorrelation, unmodelled residual serial correlation could affect confidence intervals. Ninth, the findings are drawn from the United States and Japan because, among high-income countries with comparably robust road-crash and meteorological data collection, no other country currently provides a fully open, daily, individual-level crash record equivalent to FARS or the Japanese NPA open data; the EU CARE database contains detailed individual accident records but is not publicly available at the daily individual level, and national open road-safety datasets in Europe are not harmonised, so the United States and Japan represent the best available public sources for this study design.</w:t>
       </w:r>
       <w:r>
         <w:rPr>

</xml_diff>